<commit_message>
updated Bahasa Indonesia semester 1 work
</commit_message>
<xml_diff>
--- a/!!jasonpieterkwork/BAHASA INDONESIA/SEMESTER 1/LATIHAN SOAL BI BAB 2.docx
+++ b/!!jasonpieterkwork/BAHASA INDONESIA/SEMESTER 1/LATIHAN SOAL BI BAB 2.docx
@@ -1720,7 +1720,7 @@
           <w:rFonts w:ascii="Balsamiq Sans" w:hAnsi="Balsamiq Sans"/>
           <w:lang w:val="en-US"/>
         </w:rPr>
-        <w:t>prosedur</w:t>
+        <w:t>Prosedur</w:t>
       </w:r>
       <w:proofErr w:type="spellEnd"/>
       <w:r>
@@ -2008,7 +2008,7 @@
           <w:rFonts w:ascii="Balsamiq Sans" w:hAnsi="Balsamiq Sans"/>
           <w:lang w:val="en-US"/>
         </w:rPr>
-        <w:t>prosedur</w:t>
+        <w:t>Prosedur</w:t>
       </w:r>
       <w:proofErr w:type="spellEnd"/>
       <w:r>
@@ -2258,6 +2258,361 @@
     </w:p>
     <w:p>
       <w:pPr>
+        <w:ind w:left="283"/>
+        <w:rPr>
+          <w:rFonts w:ascii="Balsamiq Sans" w:hAnsi="Balsamiq Sans"/>
+          <w:b/>
+          <w:bCs/>
+          <w:lang w:val="en-US"/>
+        </w:rPr>
+      </w:pPr>
+      <w:r>
+        <w:rPr>
+          <w:rFonts w:ascii="Balsamiq Sans" w:hAnsi="Balsamiq Sans"/>
+          <w:b/>
+          <w:bCs/>
+          <w:highlight w:val="yellow"/>
+          <w:lang w:val="en-US"/>
+        </w:rPr>
+        <w:t xml:space="preserve">4) </w:t>
+      </w:r>
+      <w:proofErr w:type="spellStart"/>
+      <w:r>
+        <w:rPr>
+          <w:rFonts w:ascii="Balsamiq Sans" w:hAnsi="Balsamiq Sans"/>
+          <w:b/>
+          <w:bCs/>
+          <w:highlight w:val="yellow"/>
+          <w:lang w:val="en-US"/>
+        </w:rPr>
+        <w:t>Menggunakan</w:t>
+      </w:r>
+      <w:proofErr w:type="spellEnd"/>
+      <w:r>
+        <w:rPr>
+          <w:rFonts w:ascii="Balsamiq Sans" w:hAnsi="Balsamiq Sans"/>
+          <w:b/>
+          <w:bCs/>
+          <w:highlight w:val="yellow"/>
+          <w:lang w:val="en-US"/>
+        </w:rPr>
+        <w:t xml:space="preserve"> </w:t>
+      </w:r>
+      <w:proofErr w:type="spellStart"/>
+      <w:r>
+        <w:rPr>
+          <w:rFonts w:ascii="Balsamiq Sans" w:hAnsi="Balsamiq Sans"/>
+          <w:b/>
+          <w:bCs/>
+          <w:highlight w:val="yellow"/>
+          <w:lang w:val="en-US"/>
+        </w:rPr>
+        <w:t>Satuan</w:t>
+      </w:r>
+      <w:proofErr w:type="spellEnd"/>
+      <w:r>
+        <w:rPr>
+          <w:rFonts w:ascii="Balsamiq Sans" w:hAnsi="Balsamiq Sans"/>
+          <w:b/>
+          <w:bCs/>
+          <w:highlight w:val="yellow"/>
+          <w:lang w:val="en-US"/>
+        </w:rPr>
+        <w:t xml:space="preserve"> </w:t>
+      </w:r>
+      <w:proofErr w:type="spellStart"/>
+      <w:r>
+        <w:rPr>
+          <w:rFonts w:ascii="Balsamiq Sans" w:hAnsi="Balsamiq Sans"/>
+          <w:b/>
+          <w:bCs/>
+          <w:highlight w:val="yellow"/>
+          <w:lang w:val="en-US"/>
+        </w:rPr>
+        <w:t>Ukuran</w:t>
+      </w:r>
+      <w:proofErr w:type="spellEnd"/>
+    </w:p>
+    <w:p>
+      <w:pPr>
+        <w:ind w:left="425"/>
+        <w:rPr>
+          <w:rFonts w:ascii="Balsamiq Sans" w:hAnsi="Balsamiq Sans"/>
+          <w:lang w:val="en-US"/>
+        </w:rPr>
+      </w:pPr>
+      <w:r>
+        <w:rPr>
+          <w:rFonts w:ascii="Balsamiq Sans" w:hAnsi="Balsamiq Sans"/>
+          <w:lang w:val="en-US"/>
+        </w:rPr>
+        <w:t xml:space="preserve">Agar </w:t>
+      </w:r>
+      <w:proofErr w:type="spellStart"/>
+      <w:r>
+        <w:rPr>
+          <w:rFonts w:ascii="Balsamiq Sans" w:hAnsi="Balsamiq Sans"/>
+          <w:lang w:val="en-US"/>
+        </w:rPr>
+        <w:t>Pembaca</w:t>
+      </w:r>
+      <w:proofErr w:type="spellEnd"/>
+      <w:r>
+        <w:rPr>
+          <w:rFonts w:ascii="Balsamiq Sans" w:hAnsi="Balsamiq Sans"/>
+          <w:lang w:val="en-US"/>
+        </w:rPr>
+        <w:t xml:space="preserve"> </w:t>
+      </w:r>
+      <w:proofErr w:type="spellStart"/>
+      <w:r>
+        <w:rPr>
+          <w:rFonts w:ascii="Balsamiq Sans" w:hAnsi="Balsamiq Sans"/>
+          <w:lang w:val="en-US"/>
+        </w:rPr>
+        <w:t>Tidak</w:t>
+      </w:r>
+      <w:proofErr w:type="spellEnd"/>
+      <w:r>
+        <w:rPr>
+          <w:rFonts w:ascii="Balsamiq Sans" w:hAnsi="Balsamiq Sans"/>
+          <w:lang w:val="en-US"/>
+        </w:rPr>
+        <w:t xml:space="preserve"> </w:t>
+      </w:r>
+      <w:proofErr w:type="spellStart"/>
+      <w:r>
+        <w:rPr>
+          <w:rFonts w:ascii="Balsamiq Sans" w:hAnsi="Balsamiq Sans"/>
+          <w:lang w:val="en-US"/>
+        </w:rPr>
+        <w:t>Melakukan</w:t>
+      </w:r>
+      <w:proofErr w:type="spellEnd"/>
+      <w:r>
+        <w:rPr>
+          <w:rFonts w:ascii="Balsamiq Sans" w:hAnsi="Balsamiq Sans"/>
+          <w:lang w:val="en-US"/>
+        </w:rPr>
+        <w:t xml:space="preserve"> </w:t>
+      </w:r>
+      <w:proofErr w:type="spellStart"/>
+      <w:r>
+        <w:rPr>
+          <w:rFonts w:ascii="Balsamiq Sans" w:hAnsi="Balsamiq Sans"/>
+          <w:lang w:val="en-US"/>
+        </w:rPr>
+        <w:t>Kesalahan</w:t>
+      </w:r>
+      <w:proofErr w:type="spellEnd"/>
+      <w:r>
+        <w:rPr>
+          <w:rFonts w:ascii="Balsamiq Sans" w:hAnsi="Balsamiq Sans"/>
+          <w:lang w:val="en-US"/>
+        </w:rPr>
+        <w:t xml:space="preserve">, </w:t>
+      </w:r>
+      <w:proofErr w:type="spellStart"/>
+      <w:r>
+        <w:rPr>
+          <w:rFonts w:ascii="Balsamiq Sans" w:hAnsi="Balsamiq Sans"/>
+          <w:lang w:val="en-US"/>
+        </w:rPr>
+        <w:t>Dalam</w:t>
+      </w:r>
+      <w:proofErr w:type="spellEnd"/>
+      <w:r>
+        <w:rPr>
+          <w:rFonts w:ascii="Balsamiq Sans" w:hAnsi="Balsamiq Sans"/>
+          <w:lang w:val="en-US"/>
+        </w:rPr>
+        <w:t xml:space="preserve"> Teks </w:t>
+      </w:r>
+      <w:proofErr w:type="spellStart"/>
+      <w:r>
+        <w:rPr>
+          <w:rFonts w:ascii="Balsamiq Sans" w:hAnsi="Balsamiq Sans"/>
+          <w:lang w:val="en-US"/>
+        </w:rPr>
+        <w:t>Prosedur</w:t>
+      </w:r>
+      <w:proofErr w:type="spellEnd"/>
+      <w:r>
+        <w:rPr>
+          <w:rFonts w:ascii="Balsamiq Sans" w:hAnsi="Balsamiq Sans"/>
+          <w:lang w:val="en-US"/>
+        </w:rPr>
+        <w:t xml:space="preserve"> </w:t>
+      </w:r>
+      <w:proofErr w:type="spellStart"/>
+      <w:r>
+        <w:rPr>
+          <w:rFonts w:ascii="Balsamiq Sans" w:hAnsi="Balsamiq Sans"/>
+          <w:lang w:val="en-US"/>
+        </w:rPr>
+        <w:t>Biasanya</w:t>
+      </w:r>
+      <w:proofErr w:type="spellEnd"/>
+      <w:r>
+        <w:rPr>
+          <w:rFonts w:ascii="Balsamiq Sans" w:hAnsi="Balsamiq Sans"/>
+          <w:lang w:val="en-US"/>
+        </w:rPr>
+        <w:t xml:space="preserve"> </w:t>
+      </w:r>
+      <w:proofErr w:type="spellStart"/>
+      <w:r>
+        <w:rPr>
+          <w:rFonts w:ascii="Balsamiq Sans" w:hAnsi="Balsamiq Sans"/>
+          <w:lang w:val="en-US"/>
+        </w:rPr>
+        <w:t>Diperinci</w:t>
+      </w:r>
+      <w:proofErr w:type="spellEnd"/>
+      <w:r>
+        <w:rPr>
+          <w:rFonts w:ascii="Balsamiq Sans" w:hAnsi="Balsamiq Sans"/>
+          <w:lang w:val="en-US"/>
+        </w:rPr>
+        <w:t xml:space="preserve"> </w:t>
+      </w:r>
+      <w:proofErr w:type="spellStart"/>
+      <w:r>
+        <w:rPr>
+          <w:rFonts w:ascii="Balsamiq Sans" w:hAnsi="Balsamiq Sans"/>
+          <w:lang w:val="en-US"/>
+        </w:rPr>
+        <w:t>Hingga</w:t>
+      </w:r>
+      <w:proofErr w:type="spellEnd"/>
+      <w:r>
+        <w:rPr>
+          <w:rFonts w:ascii="Balsamiq Sans" w:hAnsi="Balsamiq Sans"/>
+          <w:lang w:val="en-US"/>
+        </w:rPr>
+        <w:t xml:space="preserve"> </w:t>
+      </w:r>
+      <w:proofErr w:type="spellStart"/>
+      <w:r>
+        <w:rPr>
+          <w:rFonts w:ascii="Balsamiq Sans" w:hAnsi="Balsamiq Sans"/>
+          <w:lang w:val="en-US"/>
+        </w:rPr>
+        <w:t>Satuan</w:t>
+      </w:r>
+      <w:proofErr w:type="spellEnd"/>
+      <w:r>
+        <w:rPr>
+          <w:rFonts w:ascii="Balsamiq Sans" w:hAnsi="Balsamiq Sans"/>
+          <w:lang w:val="en-US"/>
+        </w:rPr>
+        <w:t xml:space="preserve"> Yang </w:t>
+      </w:r>
+      <w:proofErr w:type="spellStart"/>
+      <w:r>
+        <w:rPr>
+          <w:rFonts w:ascii="Balsamiq Sans" w:hAnsi="Balsamiq Sans"/>
+          <w:lang w:val="en-US"/>
+        </w:rPr>
+        <w:t>Pasti</w:t>
+      </w:r>
+      <w:proofErr w:type="spellEnd"/>
+      <w:r>
+        <w:rPr>
+          <w:rFonts w:ascii="Balsamiq Sans" w:hAnsi="Balsamiq Sans"/>
+          <w:lang w:val="en-US"/>
+        </w:rPr>
+        <w:t>.</w:t>
+      </w:r>
+    </w:p>
+    <w:p>
+      <w:pPr>
+        <w:ind w:left="425"/>
+        <w:rPr>
+          <w:rFonts w:ascii="Balsamiq Sans" w:hAnsi="Balsamiq Sans"/>
+          <w:lang w:val="en-US"/>
+        </w:rPr>
+      </w:pPr>
+      <w:proofErr w:type="spellStart"/>
+      <w:r>
+        <w:rPr>
+          <w:rFonts w:ascii="Balsamiq Sans" w:hAnsi="Balsamiq Sans"/>
+          <w:b/>
+          <w:bCs/>
+          <w:lang w:val="en-US"/>
+        </w:rPr>
+        <w:t>Contoh</w:t>
+      </w:r>
+      <w:proofErr w:type="spellEnd"/>
+      <w:r>
+        <w:rPr>
+          <w:rFonts w:ascii="Balsamiq Sans" w:hAnsi="Balsamiq Sans"/>
+          <w:b/>
+          <w:bCs/>
+          <w:lang w:val="en-US"/>
+        </w:rPr>
+        <w:t xml:space="preserve">: </w:t>
+      </w:r>
+      <w:proofErr w:type="spellStart"/>
+      <w:r>
+        <w:rPr>
+          <w:rFonts w:ascii="Balsamiq Sans" w:hAnsi="Balsamiq Sans"/>
+          <w:lang w:val="en-US"/>
+        </w:rPr>
+        <w:t>Sentimeter</w:t>
+      </w:r>
+      <w:proofErr w:type="spellEnd"/>
+      <w:r>
+        <w:rPr>
+          <w:rFonts w:ascii="Balsamiq Sans" w:hAnsi="Balsamiq Sans"/>
+          <w:lang w:val="en-US"/>
+        </w:rPr>
+        <w:t xml:space="preserve">, Meter, Dua </w:t>
+      </w:r>
+      <w:proofErr w:type="spellStart"/>
+      <w:r>
+        <w:rPr>
+          <w:rFonts w:ascii="Balsamiq Sans" w:hAnsi="Balsamiq Sans"/>
+          <w:lang w:val="en-US"/>
+        </w:rPr>
+        <w:t>Gelas</w:t>
+      </w:r>
+      <w:proofErr w:type="spellEnd"/>
+      <w:r>
+        <w:rPr>
+          <w:rFonts w:ascii="Balsamiq Sans" w:hAnsi="Balsamiq Sans"/>
+          <w:lang w:val="en-US"/>
+        </w:rPr>
+        <w:t xml:space="preserve">, Satu </w:t>
+      </w:r>
+      <w:proofErr w:type="spellStart"/>
+      <w:r>
+        <w:rPr>
+          <w:rFonts w:ascii="Balsamiq Sans" w:hAnsi="Balsamiq Sans"/>
+          <w:lang w:val="en-US"/>
+        </w:rPr>
+        <w:t>Sendok</w:t>
+      </w:r>
+      <w:proofErr w:type="spellEnd"/>
+      <w:r>
+        <w:rPr>
+          <w:rFonts w:ascii="Balsamiq Sans" w:hAnsi="Balsamiq Sans"/>
+          <w:lang w:val="en-US"/>
+        </w:rPr>
+        <w:t xml:space="preserve"> </w:t>
+      </w:r>
+      <w:proofErr w:type="spellStart"/>
+      <w:r>
+        <w:rPr>
+          <w:rFonts w:ascii="Balsamiq Sans" w:hAnsi="Balsamiq Sans"/>
+          <w:lang w:val="en-US"/>
+        </w:rPr>
+        <w:t>Makan</w:t>
+      </w:r>
+      <w:proofErr w:type="spellEnd"/>
+    </w:p>
+    <w:p>
+      <w:pPr>
         <w:rPr>
           <w:rFonts w:ascii="Balsamiq Sans" w:hAnsi="Balsamiq Sans"/>
           <w:b/>
@@ -2818,6 +3173,7 @@
           <w:highlight w:val="yellow"/>
           <w:lang w:val="en-ID"/>
         </w:rPr>
+        <w:lastRenderedPageBreak/>
         <w:t>2) Material</w:t>
       </w:r>
     </w:p>
@@ -2981,7 +3337,6 @@
           <w:rFonts w:ascii="Balsamiq Sans" w:hAnsi="Balsamiq Sans"/>
           <w:lang w:val="en-ID"/>
         </w:rPr>
-        <w:lastRenderedPageBreak/>
         <w:t xml:space="preserve">Bagian Langkah-Langkah </w:t>
       </w:r>
       <w:proofErr w:type="spellStart"/>
@@ -5357,7 +5712,7 @@
         <w:ind w:left="283"/>
         <w:rPr>
           <w:rFonts w:ascii="Balsamiq Sans" w:hAnsi="Balsamiq Sans"/>
-          <w:lang w:val="en-US"/>
+          <w:lang w:val="en-ID"/>
         </w:rPr>
       </w:pPr>
       <w:r>
@@ -5415,96 +5770,6 @@
         </w:rPr>
         <w:t xml:space="preserve"> Usaha.</w:t>
       </w:r>
-    </w:p>
-    <w:p>
-      <w:pPr>
-        <w:rPr>
-          <w:rFonts w:ascii="Balsamiq Sans" w:hAnsi="Balsamiq Sans"/>
-          <w:b/>
-          <w:bCs/>
-          <w:lang w:val="en-US"/>
-        </w:rPr>
-      </w:pPr>
-      <w:r>
-        <w:rPr>
-          <w:rFonts w:ascii="Balsamiq Sans" w:hAnsi="Balsamiq Sans"/>
-          <w:b/>
-          <w:bCs/>
-          <w:lang w:val="en-US"/>
-        </w:rPr>
-        <w:t xml:space="preserve">9. </w:t>
-      </w:r>
-      <w:proofErr w:type="spellStart"/>
-      <w:r>
-        <w:rPr>
-          <w:rFonts w:ascii="Balsamiq Sans" w:hAnsi="Balsamiq Sans"/>
-          <w:b/>
-          <w:bCs/>
-          <w:lang w:val="en-US"/>
-        </w:rPr>
-        <w:t>Tuliskan</w:t>
-      </w:r>
-      <w:proofErr w:type="spellEnd"/>
-      <w:r>
-        <w:rPr>
-          <w:rFonts w:ascii="Balsamiq Sans" w:hAnsi="Balsamiq Sans"/>
-          <w:b/>
-          <w:bCs/>
-          <w:lang w:val="en-US"/>
-        </w:rPr>
-        <w:t xml:space="preserve"> Langkah – Langkah </w:t>
-      </w:r>
-      <w:proofErr w:type="spellStart"/>
-      <w:r>
-        <w:rPr>
-          <w:rFonts w:ascii="Balsamiq Sans" w:hAnsi="Balsamiq Sans"/>
-          <w:b/>
-          <w:bCs/>
-          <w:lang w:val="en-US"/>
-        </w:rPr>
-        <w:t>Membuat</w:t>
-      </w:r>
-      <w:proofErr w:type="spellEnd"/>
-      <w:r>
-        <w:rPr>
-          <w:rFonts w:ascii="Balsamiq Sans" w:hAnsi="Balsamiq Sans"/>
-          <w:b/>
-          <w:bCs/>
-          <w:lang w:val="en-US"/>
-        </w:rPr>
-        <w:t xml:space="preserve"> Sim C </w:t>
-      </w:r>
-      <w:proofErr w:type="gramStart"/>
-      <w:r>
-        <w:rPr>
-          <w:rFonts w:ascii="Balsamiq Sans" w:hAnsi="Balsamiq Sans"/>
-          <w:b/>
-          <w:bCs/>
-          <w:lang w:val="en-US"/>
-        </w:rPr>
-        <w:t>Di</w:t>
-      </w:r>
-      <w:proofErr w:type="gramEnd"/>
-      <w:r>
-        <w:rPr>
-          <w:rFonts w:ascii="Balsamiq Sans" w:hAnsi="Balsamiq Sans"/>
-          <w:b/>
-          <w:bCs/>
-          <w:lang w:val="en-US"/>
-        </w:rPr>
-        <w:t xml:space="preserve"> Kantor </w:t>
-      </w:r>
-      <w:proofErr w:type="spellStart"/>
-      <w:r>
-        <w:rPr>
-          <w:rFonts w:ascii="Balsamiq Sans" w:hAnsi="Balsamiq Sans"/>
-          <w:b/>
-          <w:bCs/>
-          <w:lang w:val="en-US"/>
-        </w:rPr>
-        <w:t>Satpas</w:t>
-      </w:r>
-      <w:proofErr w:type="spellEnd"/>
     </w:p>
     <w:p>
       <w:pPr>
@@ -5514,397 +5779,86 @@
           <w:lang w:val="en-ID"/>
         </w:rPr>
       </w:pPr>
-      <w:r>
-        <w:rPr>
-          <w:rFonts w:ascii="Balsamiq Sans" w:hAnsi="Balsamiq Sans"/>
-          <w:lang w:val="en-ID"/>
-        </w:rPr>
-        <w:t xml:space="preserve">1) </w:t>
-      </w:r>
-      <w:proofErr w:type="spellStart"/>
-      <w:r>
-        <w:rPr>
-          <w:rFonts w:ascii="Balsamiq Sans" w:hAnsi="Balsamiq Sans"/>
-          <w:lang w:val="en-ID"/>
-        </w:rPr>
-        <w:t>Datang</w:t>
-      </w:r>
-      <w:proofErr w:type="spellEnd"/>
-      <w:r>
-        <w:rPr>
-          <w:rFonts w:ascii="Balsamiq Sans" w:hAnsi="Balsamiq Sans"/>
-          <w:lang w:val="en-ID"/>
-        </w:rPr>
-        <w:t xml:space="preserve"> Ke Kantor </w:t>
-      </w:r>
-      <w:proofErr w:type="spellStart"/>
-      <w:r>
-        <w:rPr>
-          <w:rFonts w:ascii="Balsamiq Sans" w:hAnsi="Balsamiq Sans"/>
-          <w:lang w:val="en-ID"/>
-        </w:rPr>
-        <w:t>Satpas</w:t>
-      </w:r>
-      <w:proofErr w:type="spellEnd"/>
-      <w:r>
-        <w:rPr>
-          <w:rFonts w:ascii="Balsamiq Sans" w:hAnsi="Balsamiq Sans"/>
-          <w:lang w:val="en-ID"/>
-        </w:rPr>
-        <w:t xml:space="preserve"> (</w:t>
-      </w:r>
-      <w:proofErr w:type="spellStart"/>
-      <w:r>
-        <w:rPr>
-          <w:rFonts w:ascii="Balsamiq Sans" w:hAnsi="Balsamiq Sans"/>
-          <w:lang w:val="en-ID"/>
-        </w:rPr>
-        <w:t>Satuan</w:t>
-      </w:r>
-      <w:proofErr w:type="spellEnd"/>
-      <w:r>
-        <w:rPr>
-          <w:rFonts w:ascii="Balsamiq Sans" w:hAnsi="Balsamiq Sans"/>
-          <w:lang w:val="en-ID"/>
-        </w:rPr>
-        <w:t xml:space="preserve"> </w:t>
-      </w:r>
-      <w:proofErr w:type="spellStart"/>
-      <w:r>
-        <w:rPr>
-          <w:rFonts w:ascii="Balsamiq Sans" w:hAnsi="Balsamiq Sans"/>
-          <w:lang w:val="en-ID"/>
-        </w:rPr>
-        <w:t>Penyelenggara</w:t>
-      </w:r>
-      <w:proofErr w:type="spellEnd"/>
-      <w:r>
-        <w:rPr>
-          <w:rFonts w:ascii="Balsamiq Sans" w:hAnsi="Balsamiq Sans"/>
-          <w:lang w:val="en-ID"/>
-        </w:rPr>
-        <w:t xml:space="preserve"> </w:t>
-      </w:r>
-      <w:proofErr w:type="spellStart"/>
-      <w:r>
-        <w:rPr>
-          <w:rFonts w:ascii="Balsamiq Sans" w:hAnsi="Balsamiq Sans"/>
-          <w:lang w:val="en-ID"/>
-        </w:rPr>
-        <w:t>Administrasi</w:t>
-      </w:r>
-      <w:proofErr w:type="spellEnd"/>
-      <w:r>
-        <w:rPr>
-          <w:rFonts w:ascii="Balsamiq Sans" w:hAnsi="Balsamiq Sans"/>
-          <w:lang w:val="en-ID"/>
-        </w:rPr>
-        <w:t xml:space="preserve"> Sim) </w:t>
-      </w:r>
-      <w:proofErr w:type="spellStart"/>
-      <w:r>
-        <w:rPr>
-          <w:rFonts w:ascii="Balsamiq Sans" w:hAnsi="Balsamiq Sans"/>
-          <w:lang w:val="en-ID"/>
-        </w:rPr>
-        <w:t>Terdekat</w:t>
-      </w:r>
-      <w:proofErr w:type="spellEnd"/>
-      <w:r>
-        <w:rPr>
-          <w:rFonts w:ascii="Balsamiq Sans" w:hAnsi="Balsamiq Sans"/>
-          <w:lang w:val="en-ID"/>
-        </w:rPr>
-        <w:t xml:space="preserve"> </w:t>
-      </w:r>
-      <w:proofErr w:type="spellStart"/>
-      <w:r>
-        <w:rPr>
-          <w:rFonts w:ascii="Balsamiq Sans" w:hAnsi="Balsamiq Sans"/>
-          <w:lang w:val="en-ID"/>
-        </w:rPr>
-        <w:t>Dengan</w:t>
-      </w:r>
-      <w:proofErr w:type="spellEnd"/>
-      <w:r>
-        <w:rPr>
-          <w:rFonts w:ascii="Balsamiq Sans" w:hAnsi="Balsamiq Sans"/>
-          <w:lang w:val="en-ID"/>
-        </w:rPr>
-        <w:t xml:space="preserve"> </w:t>
-      </w:r>
-      <w:proofErr w:type="spellStart"/>
-      <w:r>
-        <w:rPr>
-          <w:rFonts w:ascii="Balsamiq Sans" w:hAnsi="Balsamiq Sans"/>
-          <w:lang w:val="en-ID"/>
-        </w:rPr>
-        <w:t>Membawa</w:t>
-      </w:r>
-      <w:proofErr w:type="spellEnd"/>
-      <w:r>
-        <w:rPr>
-          <w:rFonts w:ascii="Balsamiq Sans" w:hAnsi="Balsamiq Sans"/>
-          <w:lang w:val="en-ID"/>
-        </w:rPr>
-        <w:t xml:space="preserve"> </w:t>
-      </w:r>
-      <w:proofErr w:type="spellStart"/>
-      <w:r>
-        <w:rPr>
-          <w:rFonts w:ascii="Balsamiq Sans" w:hAnsi="Balsamiq Sans"/>
-          <w:lang w:val="en-ID"/>
-        </w:rPr>
-        <w:t>Semua</w:t>
-      </w:r>
-      <w:proofErr w:type="spellEnd"/>
-      <w:r>
-        <w:rPr>
-          <w:rFonts w:ascii="Balsamiq Sans" w:hAnsi="Balsamiq Sans"/>
-          <w:lang w:val="en-ID"/>
-        </w:rPr>
-        <w:t xml:space="preserve"> </w:t>
-      </w:r>
-      <w:proofErr w:type="spellStart"/>
-      <w:r>
-        <w:rPr>
-          <w:rFonts w:ascii="Balsamiq Sans" w:hAnsi="Balsamiq Sans"/>
-          <w:lang w:val="en-ID"/>
-        </w:rPr>
-        <w:t>Dokumen</w:t>
-      </w:r>
-      <w:proofErr w:type="spellEnd"/>
-      <w:r>
-        <w:rPr>
-          <w:rFonts w:ascii="Balsamiq Sans" w:hAnsi="Balsamiq Sans"/>
-          <w:lang w:val="en-ID"/>
-        </w:rPr>
-        <w:t xml:space="preserve"> Yang </w:t>
-      </w:r>
-      <w:proofErr w:type="spellStart"/>
-      <w:r>
-        <w:rPr>
-          <w:rFonts w:ascii="Balsamiq Sans" w:hAnsi="Balsamiq Sans"/>
-          <w:lang w:val="en-ID"/>
-        </w:rPr>
-        <w:t>Dimasukkan</w:t>
-      </w:r>
-      <w:proofErr w:type="spellEnd"/>
-      <w:r>
-        <w:rPr>
-          <w:rFonts w:ascii="Balsamiq Sans" w:hAnsi="Balsamiq Sans"/>
-          <w:lang w:val="en-ID"/>
-        </w:rPr>
-        <w:t xml:space="preserve"> Pada </w:t>
-      </w:r>
-      <w:proofErr w:type="spellStart"/>
-      <w:r>
-        <w:rPr>
-          <w:rFonts w:ascii="Balsamiq Sans" w:hAnsi="Balsamiq Sans"/>
-          <w:lang w:val="en-ID"/>
-        </w:rPr>
-        <w:t>Sebuah</w:t>
-      </w:r>
-      <w:proofErr w:type="spellEnd"/>
-      <w:r>
-        <w:rPr>
-          <w:rFonts w:ascii="Balsamiq Sans" w:hAnsi="Balsamiq Sans"/>
-          <w:lang w:val="en-ID"/>
-        </w:rPr>
-        <w:t xml:space="preserve"> Map. </w:t>
-      </w:r>
     </w:p>
     <w:p>
       <w:pPr>
         <w:ind w:left="283"/>
         <w:rPr>
           <w:rFonts w:ascii="Balsamiq Sans" w:hAnsi="Balsamiq Sans"/>
-          <w:lang w:val="en-ID"/>
+          <w:lang w:val="en-US"/>
         </w:rPr>
       </w:pPr>
-      <w:r>
-        <w:rPr>
-          <w:rFonts w:ascii="Balsamiq Sans" w:hAnsi="Balsamiq Sans"/>
-          <w:lang w:val="en-ID"/>
-        </w:rPr>
-        <w:t xml:space="preserve">2) </w:t>
-      </w:r>
-      <w:proofErr w:type="spellStart"/>
-      <w:r>
-        <w:rPr>
-          <w:rFonts w:ascii="Balsamiq Sans" w:hAnsi="Balsamiq Sans"/>
-          <w:lang w:val="en-ID"/>
-        </w:rPr>
-        <w:t>Jangan</w:t>
-      </w:r>
-      <w:proofErr w:type="spellEnd"/>
-      <w:r>
-        <w:rPr>
-          <w:rFonts w:ascii="Balsamiq Sans" w:hAnsi="Balsamiq Sans"/>
-          <w:lang w:val="en-ID"/>
-        </w:rPr>
-        <w:t xml:space="preserve"> </w:t>
-      </w:r>
-      <w:proofErr w:type="spellStart"/>
-      <w:r>
-        <w:rPr>
-          <w:rFonts w:ascii="Balsamiq Sans" w:hAnsi="Balsamiq Sans"/>
-          <w:lang w:val="en-ID"/>
-        </w:rPr>
-        <w:t>Mengenakan</w:t>
-      </w:r>
-      <w:proofErr w:type="spellEnd"/>
-      <w:r>
-        <w:rPr>
-          <w:rFonts w:ascii="Balsamiq Sans" w:hAnsi="Balsamiq Sans"/>
-          <w:lang w:val="en-ID"/>
-        </w:rPr>
-        <w:t xml:space="preserve"> </w:t>
-      </w:r>
-      <w:proofErr w:type="spellStart"/>
-      <w:r>
-        <w:rPr>
-          <w:rFonts w:ascii="Balsamiq Sans" w:hAnsi="Balsamiq Sans"/>
-          <w:lang w:val="en-ID"/>
-        </w:rPr>
-        <w:t>Pakaian</w:t>
-      </w:r>
-      <w:proofErr w:type="spellEnd"/>
-      <w:r>
-        <w:rPr>
-          <w:rFonts w:ascii="Balsamiq Sans" w:hAnsi="Balsamiq Sans"/>
-          <w:lang w:val="en-ID"/>
-        </w:rPr>
-        <w:t xml:space="preserve"> </w:t>
-      </w:r>
-      <w:proofErr w:type="spellStart"/>
-      <w:r>
-        <w:rPr>
-          <w:rFonts w:ascii="Balsamiq Sans" w:hAnsi="Balsamiq Sans"/>
-          <w:lang w:val="en-ID"/>
-        </w:rPr>
-        <w:t>Berwarna</w:t>
-      </w:r>
-      <w:proofErr w:type="spellEnd"/>
-      <w:r>
-        <w:rPr>
-          <w:rFonts w:ascii="Balsamiq Sans" w:hAnsi="Balsamiq Sans"/>
-          <w:lang w:val="en-ID"/>
-        </w:rPr>
-        <w:t xml:space="preserve"> Biru </w:t>
-      </w:r>
-      <w:proofErr w:type="spellStart"/>
-      <w:r>
-        <w:rPr>
-          <w:rFonts w:ascii="Balsamiq Sans" w:hAnsi="Balsamiq Sans"/>
-          <w:lang w:val="en-ID"/>
-        </w:rPr>
-        <w:t>Untuk</w:t>
-      </w:r>
-      <w:proofErr w:type="spellEnd"/>
-      <w:r>
-        <w:rPr>
-          <w:rFonts w:ascii="Balsamiq Sans" w:hAnsi="Balsamiq Sans"/>
-          <w:lang w:val="en-ID"/>
-        </w:rPr>
-        <w:t xml:space="preserve"> </w:t>
-      </w:r>
-      <w:proofErr w:type="spellStart"/>
-      <w:r>
-        <w:rPr>
-          <w:rFonts w:ascii="Balsamiq Sans" w:hAnsi="Balsamiq Sans"/>
-          <w:lang w:val="en-ID"/>
-        </w:rPr>
-        <w:t>Menghindari</w:t>
-      </w:r>
-      <w:proofErr w:type="spellEnd"/>
-      <w:r>
-        <w:rPr>
-          <w:rFonts w:ascii="Balsamiq Sans" w:hAnsi="Balsamiq Sans"/>
-          <w:lang w:val="en-ID"/>
-        </w:rPr>
-        <w:t xml:space="preserve"> </w:t>
-      </w:r>
-      <w:proofErr w:type="spellStart"/>
-      <w:r>
-        <w:rPr>
-          <w:rFonts w:ascii="Balsamiq Sans" w:hAnsi="Balsamiq Sans"/>
-          <w:lang w:val="en-ID"/>
-        </w:rPr>
-        <w:t>Kesamaan</w:t>
-      </w:r>
-      <w:proofErr w:type="spellEnd"/>
-      <w:r>
-        <w:rPr>
-          <w:rFonts w:ascii="Balsamiq Sans" w:hAnsi="Balsamiq Sans"/>
-          <w:lang w:val="en-ID"/>
-        </w:rPr>
-        <w:t xml:space="preserve"> </w:t>
-      </w:r>
-      <w:proofErr w:type="spellStart"/>
-      <w:r>
-        <w:rPr>
-          <w:rFonts w:ascii="Balsamiq Sans" w:hAnsi="Balsamiq Sans"/>
-          <w:lang w:val="en-ID"/>
-        </w:rPr>
-        <w:t>Warna</w:t>
-      </w:r>
-      <w:proofErr w:type="spellEnd"/>
-      <w:r>
-        <w:rPr>
-          <w:rFonts w:ascii="Balsamiq Sans" w:hAnsi="Balsamiq Sans"/>
-          <w:lang w:val="en-ID"/>
-        </w:rPr>
-        <w:t xml:space="preserve"> </w:t>
-      </w:r>
-      <w:proofErr w:type="spellStart"/>
-      <w:r>
-        <w:rPr>
-          <w:rFonts w:ascii="Balsamiq Sans" w:hAnsi="Balsamiq Sans"/>
-          <w:lang w:val="en-ID"/>
-        </w:rPr>
-        <w:t>Dengan</w:t>
-      </w:r>
-      <w:proofErr w:type="spellEnd"/>
-      <w:r>
-        <w:rPr>
-          <w:rFonts w:ascii="Balsamiq Sans" w:hAnsi="Balsamiq Sans"/>
-          <w:lang w:val="en-ID"/>
-        </w:rPr>
-        <w:t xml:space="preserve"> Background </w:t>
-      </w:r>
-      <w:proofErr w:type="spellStart"/>
-      <w:r>
-        <w:rPr>
-          <w:rFonts w:ascii="Balsamiq Sans" w:hAnsi="Balsamiq Sans"/>
-          <w:lang w:val="en-ID"/>
-        </w:rPr>
-        <w:t>Saat</w:t>
-      </w:r>
-      <w:proofErr w:type="spellEnd"/>
-      <w:r>
-        <w:rPr>
-          <w:rFonts w:ascii="Balsamiq Sans" w:hAnsi="Balsamiq Sans"/>
-          <w:lang w:val="en-ID"/>
-        </w:rPr>
-        <w:t xml:space="preserve"> </w:t>
-      </w:r>
-      <w:proofErr w:type="spellStart"/>
-      <w:r>
-        <w:rPr>
-          <w:rFonts w:ascii="Balsamiq Sans" w:hAnsi="Balsamiq Sans"/>
-          <w:lang w:val="en-ID"/>
-        </w:rPr>
-        <w:t>Pengambilan</w:t>
-      </w:r>
-      <w:proofErr w:type="spellEnd"/>
-      <w:r>
-        <w:rPr>
-          <w:rFonts w:ascii="Balsamiq Sans" w:hAnsi="Balsamiq Sans"/>
-          <w:lang w:val="en-ID"/>
-        </w:rPr>
-        <w:t xml:space="preserve"> Foto Sim. </w:t>
-      </w:r>
+    </w:p>
+    <w:p>
+      <w:pPr>
+        <w:rPr>
+          <w:rFonts w:ascii="Balsamiq Sans" w:hAnsi="Balsamiq Sans"/>
+          <w:b/>
+          <w:bCs/>
+          <w:lang w:val="en-US"/>
+        </w:rPr>
+      </w:pPr>
+      <w:r>
+        <w:rPr>
+          <w:rFonts w:ascii="Balsamiq Sans" w:hAnsi="Balsamiq Sans"/>
+          <w:b/>
+          <w:bCs/>
+          <w:lang w:val="en-US"/>
+        </w:rPr>
+        <w:lastRenderedPageBreak/>
+        <w:t xml:space="preserve">9. </w:t>
+      </w:r>
+      <w:proofErr w:type="spellStart"/>
+      <w:r>
+        <w:rPr>
+          <w:rFonts w:ascii="Balsamiq Sans" w:hAnsi="Balsamiq Sans"/>
+          <w:b/>
+          <w:bCs/>
+          <w:lang w:val="en-US"/>
+        </w:rPr>
+        <w:t>Tuliskan</w:t>
+      </w:r>
+      <w:proofErr w:type="spellEnd"/>
+      <w:r>
+        <w:rPr>
+          <w:rFonts w:ascii="Balsamiq Sans" w:hAnsi="Balsamiq Sans"/>
+          <w:b/>
+          <w:bCs/>
+          <w:lang w:val="en-US"/>
+        </w:rPr>
+        <w:t xml:space="preserve"> Langkah – Langkah </w:t>
+      </w:r>
+      <w:proofErr w:type="spellStart"/>
+      <w:r>
+        <w:rPr>
+          <w:rFonts w:ascii="Balsamiq Sans" w:hAnsi="Balsamiq Sans"/>
+          <w:b/>
+          <w:bCs/>
+          <w:lang w:val="en-US"/>
+        </w:rPr>
+        <w:t>Membuat</w:t>
+      </w:r>
+      <w:proofErr w:type="spellEnd"/>
+      <w:r>
+        <w:rPr>
+          <w:rFonts w:ascii="Balsamiq Sans" w:hAnsi="Balsamiq Sans"/>
+          <w:b/>
+          <w:bCs/>
+          <w:lang w:val="en-US"/>
+        </w:rPr>
+        <w:t xml:space="preserve"> Sim C Di Kantor </w:t>
+      </w:r>
+      <w:proofErr w:type="spellStart"/>
+      <w:r>
+        <w:rPr>
+          <w:rFonts w:ascii="Balsamiq Sans" w:hAnsi="Balsamiq Sans"/>
+          <w:b/>
+          <w:bCs/>
+          <w:lang w:val="en-US"/>
+        </w:rPr>
+        <w:t>Satpas</w:t>
+      </w:r>
+      <w:proofErr w:type="spellEnd"/>
     </w:p>
     <w:p>
       <w:pPr>
@@ -5919,15 +5873,47 @@
           <w:rFonts w:ascii="Balsamiq Sans" w:hAnsi="Balsamiq Sans"/>
           <w:lang w:val="en-ID"/>
         </w:rPr>
-        <w:t xml:space="preserve">3) </w:t>
-      </w:r>
-      <w:proofErr w:type="spellStart"/>
-      <w:r>
-        <w:rPr>
-          <w:rFonts w:ascii="Balsamiq Sans" w:hAnsi="Balsamiq Sans"/>
-          <w:lang w:val="en-ID"/>
-        </w:rPr>
-        <w:t>Mengisi</w:t>
+        <w:t xml:space="preserve">1) </w:t>
+      </w:r>
+      <w:proofErr w:type="spellStart"/>
+      <w:r>
+        <w:rPr>
+          <w:rFonts w:ascii="Balsamiq Sans" w:hAnsi="Balsamiq Sans"/>
+          <w:lang w:val="en-ID"/>
+        </w:rPr>
+        <w:t>Datang</w:t>
+      </w:r>
+      <w:proofErr w:type="spellEnd"/>
+      <w:r>
+        <w:rPr>
+          <w:rFonts w:ascii="Balsamiq Sans" w:hAnsi="Balsamiq Sans"/>
+          <w:lang w:val="en-ID"/>
+        </w:rPr>
+        <w:t xml:space="preserve"> Ke Kantor </w:t>
+      </w:r>
+      <w:proofErr w:type="spellStart"/>
+      <w:r>
+        <w:rPr>
+          <w:rFonts w:ascii="Balsamiq Sans" w:hAnsi="Balsamiq Sans"/>
+          <w:lang w:val="en-ID"/>
+        </w:rPr>
+        <w:t>Satpas</w:t>
+      </w:r>
+      <w:proofErr w:type="spellEnd"/>
+      <w:r>
+        <w:rPr>
+          <w:rFonts w:ascii="Balsamiq Sans" w:hAnsi="Balsamiq Sans"/>
+          <w:lang w:val="en-ID"/>
+        </w:rPr>
+        <w:t xml:space="preserve"> (</w:t>
+      </w:r>
+      <w:proofErr w:type="spellStart"/>
+      <w:r>
+        <w:rPr>
+          <w:rFonts w:ascii="Balsamiq Sans" w:hAnsi="Balsamiq Sans"/>
+          <w:lang w:val="en-ID"/>
+        </w:rPr>
+        <w:t>Satuan</w:t>
       </w:r>
       <w:proofErr w:type="spellEnd"/>
       <w:r>
@@ -5943,7 +5929,7 @@
           <w:rFonts w:ascii="Balsamiq Sans" w:hAnsi="Balsamiq Sans"/>
           <w:lang w:val="en-ID"/>
         </w:rPr>
-        <w:t>Formulir</w:t>
+        <w:t>Penyelenggara</w:t>
       </w:r>
       <w:proofErr w:type="spellEnd"/>
       <w:r>
@@ -5959,7 +5945,87 @@
           <w:rFonts w:ascii="Balsamiq Sans" w:hAnsi="Balsamiq Sans"/>
           <w:lang w:val="en-ID"/>
         </w:rPr>
-        <w:t>Pendaftaran</w:t>
+        <w:t>Administrasi</w:t>
+      </w:r>
+      <w:proofErr w:type="spellEnd"/>
+      <w:r>
+        <w:rPr>
+          <w:rFonts w:ascii="Balsamiq Sans" w:hAnsi="Balsamiq Sans"/>
+          <w:lang w:val="en-ID"/>
+        </w:rPr>
+        <w:t xml:space="preserve"> Sim) </w:t>
+      </w:r>
+      <w:proofErr w:type="spellStart"/>
+      <w:r>
+        <w:rPr>
+          <w:rFonts w:ascii="Balsamiq Sans" w:hAnsi="Balsamiq Sans"/>
+          <w:lang w:val="en-ID"/>
+        </w:rPr>
+        <w:t>Terdekat</w:t>
+      </w:r>
+      <w:proofErr w:type="spellEnd"/>
+      <w:r>
+        <w:rPr>
+          <w:rFonts w:ascii="Balsamiq Sans" w:hAnsi="Balsamiq Sans"/>
+          <w:lang w:val="en-ID"/>
+        </w:rPr>
+        <w:t xml:space="preserve"> </w:t>
+      </w:r>
+      <w:proofErr w:type="spellStart"/>
+      <w:r>
+        <w:rPr>
+          <w:rFonts w:ascii="Balsamiq Sans" w:hAnsi="Balsamiq Sans"/>
+          <w:lang w:val="en-ID"/>
+        </w:rPr>
+        <w:t>Dengan</w:t>
+      </w:r>
+      <w:proofErr w:type="spellEnd"/>
+      <w:r>
+        <w:rPr>
+          <w:rFonts w:ascii="Balsamiq Sans" w:hAnsi="Balsamiq Sans"/>
+          <w:lang w:val="en-ID"/>
+        </w:rPr>
+        <w:t xml:space="preserve"> </w:t>
+      </w:r>
+      <w:proofErr w:type="spellStart"/>
+      <w:r>
+        <w:rPr>
+          <w:rFonts w:ascii="Balsamiq Sans" w:hAnsi="Balsamiq Sans"/>
+          <w:lang w:val="en-ID"/>
+        </w:rPr>
+        <w:t>Membawa</w:t>
+      </w:r>
+      <w:proofErr w:type="spellEnd"/>
+      <w:r>
+        <w:rPr>
+          <w:rFonts w:ascii="Balsamiq Sans" w:hAnsi="Balsamiq Sans"/>
+          <w:lang w:val="en-ID"/>
+        </w:rPr>
+        <w:t xml:space="preserve"> </w:t>
+      </w:r>
+      <w:proofErr w:type="spellStart"/>
+      <w:r>
+        <w:rPr>
+          <w:rFonts w:ascii="Balsamiq Sans" w:hAnsi="Balsamiq Sans"/>
+          <w:lang w:val="en-ID"/>
+        </w:rPr>
+        <w:t>Semua</w:t>
+      </w:r>
+      <w:proofErr w:type="spellEnd"/>
+      <w:r>
+        <w:rPr>
+          <w:rFonts w:ascii="Balsamiq Sans" w:hAnsi="Balsamiq Sans"/>
+          <w:lang w:val="en-ID"/>
+        </w:rPr>
+        <w:t xml:space="preserve"> </w:t>
+      </w:r>
+      <w:proofErr w:type="spellStart"/>
+      <w:r>
+        <w:rPr>
+          <w:rFonts w:ascii="Balsamiq Sans" w:hAnsi="Balsamiq Sans"/>
+          <w:lang w:val="en-ID"/>
+        </w:rPr>
+        <w:t>Dokumen</w:t>
       </w:r>
       <w:proofErr w:type="spellEnd"/>
       <w:r>
@@ -5975,15 +6041,31 @@
           <w:rFonts w:ascii="Balsamiq Sans" w:hAnsi="Balsamiq Sans"/>
           <w:lang w:val="en-ID"/>
         </w:rPr>
-        <w:t>Disediakan</w:t>
-      </w:r>
-      <w:proofErr w:type="spellEnd"/>
-      <w:r>
-        <w:rPr>
-          <w:rFonts w:ascii="Balsamiq Sans" w:hAnsi="Balsamiq Sans"/>
-          <w:lang w:val="en-ID"/>
-        </w:rPr>
-        <w:t xml:space="preserve">. </w:t>
+        <w:t>Dimasukkan</w:t>
+      </w:r>
+      <w:proofErr w:type="spellEnd"/>
+      <w:r>
+        <w:rPr>
+          <w:rFonts w:ascii="Balsamiq Sans" w:hAnsi="Balsamiq Sans"/>
+          <w:lang w:val="en-ID"/>
+        </w:rPr>
+        <w:t xml:space="preserve"> Pada </w:t>
+      </w:r>
+      <w:proofErr w:type="spellStart"/>
+      <w:r>
+        <w:rPr>
+          <w:rFonts w:ascii="Balsamiq Sans" w:hAnsi="Balsamiq Sans"/>
+          <w:lang w:val="en-ID"/>
+        </w:rPr>
+        <w:t>Sebuah</w:t>
+      </w:r>
+      <w:proofErr w:type="spellEnd"/>
+      <w:r>
+        <w:rPr>
+          <w:rFonts w:ascii="Balsamiq Sans" w:hAnsi="Balsamiq Sans"/>
+          <w:lang w:val="en-ID"/>
+        </w:rPr>
+        <w:t xml:space="preserve"> Map. </w:t>
       </w:r>
     </w:p>
     <w:p>
@@ -5999,16 +6081,15 @@
           <w:rFonts w:ascii="Balsamiq Sans" w:hAnsi="Balsamiq Sans"/>
           <w:lang w:val="en-ID"/>
         </w:rPr>
-        <w:lastRenderedPageBreak/>
-        <w:t xml:space="preserve">4) </w:t>
-      </w:r>
-      <w:proofErr w:type="spellStart"/>
-      <w:r>
-        <w:rPr>
-          <w:rFonts w:ascii="Balsamiq Sans" w:hAnsi="Balsamiq Sans"/>
-          <w:lang w:val="en-ID"/>
-        </w:rPr>
-        <w:t>Membayar</w:t>
+        <w:t xml:space="preserve">2) </w:t>
+      </w:r>
+      <w:proofErr w:type="spellStart"/>
+      <w:r>
+        <w:rPr>
+          <w:rFonts w:ascii="Balsamiq Sans" w:hAnsi="Balsamiq Sans"/>
+          <w:lang w:val="en-ID"/>
+        </w:rPr>
+        <w:t>Jangan</w:t>
       </w:r>
       <w:proofErr w:type="spellEnd"/>
       <w:r>
@@ -6024,7 +6105,7 @@
           <w:rFonts w:ascii="Balsamiq Sans" w:hAnsi="Balsamiq Sans"/>
           <w:lang w:val="en-ID"/>
         </w:rPr>
-        <w:t>Biasya</w:t>
+        <w:t>Mengenakan</w:t>
       </w:r>
       <w:proofErr w:type="spellEnd"/>
       <w:r>
@@ -6040,23 +6121,7 @@
           <w:rFonts w:ascii="Balsamiq Sans" w:hAnsi="Balsamiq Sans"/>
           <w:lang w:val="en-ID"/>
         </w:rPr>
-        <w:t>Pendaftaran</w:t>
-      </w:r>
-      <w:proofErr w:type="spellEnd"/>
-      <w:r>
-        <w:rPr>
-          <w:rFonts w:ascii="Balsamiq Sans" w:hAnsi="Balsamiq Sans"/>
-          <w:lang w:val="en-ID"/>
-        </w:rPr>
-        <w:t xml:space="preserve">, </w:t>
-      </w:r>
-      <w:proofErr w:type="spellStart"/>
-      <w:r>
-        <w:rPr>
-          <w:rFonts w:ascii="Balsamiq Sans" w:hAnsi="Balsamiq Sans"/>
-          <w:lang w:val="en-ID"/>
-        </w:rPr>
-        <w:t>Termasuk</w:t>
+        <w:t>Pakaian</w:t>
       </w:r>
       <w:proofErr w:type="spellEnd"/>
       <w:r>
@@ -6072,31 +6137,127 @@
           <w:rFonts w:ascii="Balsamiq Sans" w:hAnsi="Balsamiq Sans"/>
           <w:lang w:val="en-ID"/>
         </w:rPr>
-        <w:t>Asuransi</w:t>
-      </w:r>
-      <w:proofErr w:type="spellEnd"/>
-      <w:r>
-        <w:rPr>
-          <w:rFonts w:ascii="Balsamiq Sans" w:hAnsi="Balsamiq Sans"/>
-          <w:lang w:val="en-ID"/>
-        </w:rPr>
-        <w:t xml:space="preserve"> Dan </w:t>
-      </w:r>
-      <w:proofErr w:type="spellStart"/>
-      <w:r>
-        <w:rPr>
-          <w:rFonts w:ascii="Balsamiq Sans" w:hAnsi="Balsamiq Sans"/>
-          <w:lang w:val="en-ID"/>
-        </w:rPr>
-        <w:t>Tes</w:t>
-      </w:r>
-      <w:proofErr w:type="spellEnd"/>
-      <w:r>
-        <w:rPr>
-          <w:rFonts w:ascii="Balsamiq Sans" w:hAnsi="Balsamiq Sans"/>
-          <w:lang w:val="en-ID"/>
-        </w:rPr>
-        <w:t xml:space="preserve"> Kesehatan. </w:t>
+        <w:t>Berwarna</w:t>
+      </w:r>
+      <w:proofErr w:type="spellEnd"/>
+      <w:r>
+        <w:rPr>
+          <w:rFonts w:ascii="Balsamiq Sans" w:hAnsi="Balsamiq Sans"/>
+          <w:lang w:val="en-ID"/>
+        </w:rPr>
+        <w:t xml:space="preserve"> Biru </w:t>
+      </w:r>
+      <w:proofErr w:type="spellStart"/>
+      <w:r>
+        <w:rPr>
+          <w:rFonts w:ascii="Balsamiq Sans" w:hAnsi="Balsamiq Sans"/>
+          <w:lang w:val="en-ID"/>
+        </w:rPr>
+        <w:t>Untuk</w:t>
+      </w:r>
+      <w:proofErr w:type="spellEnd"/>
+      <w:r>
+        <w:rPr>
+          <w:rFonts w:ascii="Balsamiq Sans" w:hAnsi="Balsamiq Sans"/>
+          <w:lang w:val="en-ID"/>
+        </w:rPr>
+        <w:t xml:space="preserve"> </w:t>
+      </w:r>
+      <w:proofErr w:type="spellStart"/>
+      <w:r>
+        <w:rPr>
+          <w:rFonts w:ascii="Balsamiq Sans" w:hAnsi="Balsamiq Sans"/>
+          <w:lang w:val="en-ID"/>
+        </w:rPr>
+        <w:t>Menghindari</w:t>
+      </w:r>
+      <w:proofErr w:type="spellEnd"/>
+      <w:r>
+        <w:rPr>
+          <w:rFonts w:ascii="Balsamiq Sans" w:hAnsi="Balsamiq Sans"/>
+          <w:lang w:val="en-ID"/>
+        </w:rPr>
+        <w:t xml:space="preserve"> </w:t>
+      </w:r>
+      <w:proofErr w:type="spellStart"/>
+      <w:r>
+        <w:rPr>
+          <w:rFonts w:ascii="Balsamiq Sans" w:hAnsi="Balsamiq Sans"/>
+          <w:lang w:val="en-ID"/>
+        </w:rPr>
+        <w:t>Kesamaan</w:t>
+      </w:r>
+      <w:proofErr w:type="spellEnd"/>
+      <w:r>
+        <w:rPr>
+          <w:rFonts w:ascii="Balsamiq Sans" w:hAnsi="Balsamiq Sans"/>
+          <w:lang w:val="en-ID"/>
+        </w:rPr>
+        <w:t xml:space="preserve"> </w:t>
+      </w:r>
+      <w:proofErr w:type="spellStart"/>
+      <w:r>
+        <w:rPr>
+          <w:rFonts w:ascii="Balsamiq Sans" w:hAnsi="Balsamiq Sans"/>
+          <w:lang w:val="en-ID"/>
+        </w:rPr>
+        <w:t>Warna</w:t>
+      </w:r>
+      <w:proofErr w:type="spellEnd"/>
+      <w:r>
+        <w:rPr>
+          <w:rFonts w:ascii="Balsamiq Sans" w:hAnsi="Balsamiq Sans"/>
+          <w:lang w:val="en-ID"/>
+        </w:rPr>
+        <w:t xml:space="preserve"> </w:t>
+      </w:r>
+      <w:proofErr w:type="spellStart"/>
+      <w:r>
+        <w:rPr>
+          <w:rFonts w:ascii="Balsamiq Sans" w:hAnsi="Balsamiq Sans"/>
+          <w:lang w:val="en-ID"/>
+        </w:rPr>
+        <w:t>Dengan</w:t>
+      </w:r>
+      <w:proofErr w:type="spellEnd"/>
+      <w:r>
+        <w:rPr>
+          <w:rFonts w:ascii="Balsamiq Sans" w:hAnsi="Balsamiq Sans"/>
+          <w:lang w:val="en-ID"/>
+        </w:rPr>
+        <w:t xml:space="preserve"> Background </w:t>
+      </w:r>
+      <w:proofErr w:type="spellStart"/>
+      <w:r>
+        <w:rPr>
+          <w:rFonts w:ascii="Balsamiq Sans" w:hAnsi="Balsamiq Sans"/>
+          <w:lang w:val="en-ID"/>
+        </w:rPr>
+        <w:t>Saat</w:t>
+      </w:r>
+      <w:proofErr w:type="spellEnd"/>
+      <w:r>
+        <w:rPr>
+          <w:rFonts w:ascii="Balsamiq Sans" w:hAnsi="Balsamiq Sans"/>
+          <w:lang w:val="en-ID"/>
+        </w:rPr>
+        <w:t xml:space="preserve"> </w:t>
+      </w:r>
+      <w:proofErr w:type="spellStart"/>
+      <w:r>
+        <w:rPr>
+          <w:rFonts w:ascii="Balsamiq Sans" w:hAnsi="Balsamiq Sans"/>
+          <w:lang w:val="en-ID"/>
+        </w:rPr>
+        <w:t>Pengambilan</w:t>
+      </w:r>
+      <w:proofErr w:type="spellEnd"/>
+      <w:r>
+        <w:rPr>
+          <w:rFonts w:ascii="Balsamiq Sans" w:hAnsi="Balsamiq Sans"/>
+          <w:lang w:val="en-ID"/>
+        </w:rPr>
+        <w:t xml:space="preserve"> Foto Sim. </w:t>
       </w:r>
     </w:p>
     <w:p>
@@ -6112,15 +6273,15 @@
           <w:rFonts w:ascii="Balsamiq Sans" w:hAnsi="Balsamiq Sans"/>
           <w:lang w:val="en-ID"/>
         </w:rPr>
-        <w:t xml:space="preserve">5) </w:t>
-      </w:r>
-      <w:proofErr w:type="spellStart"/>
-      <w:r>
-        <w:rPr>
-          <w:rFonts w:ascii="Balsamiq Sans" w:hAnsi="Balsamiq Sans"/>
-          <w:lang w:val="en-ID"/>
-        </w:rPr>
-        <w:t>Melakukan</w:t>
+        <w:t xml:space="preserve">3) </w:t>
+      </w:r>
+      <w:proofErr w:type="spellStart"/>
+      <w:r>
+        <w:rPr>
+          <w:rFonts w:ascii="Balsamiq Sans" w:hAnsi="Balsamiq Sans"/>
+          <w:lang w:val="en-ID"/>
+        </w:rPr>
+        <w:t>Mengisi</w:t>
       </w:r>
       <w:proofErr w:type="spellEnd"/>
       <w:r>
@@ -6136,23 +6297,39 @@
           <w:rFonts w:ascii="Balsamiq Sans" w:hAnsi="Balsamiq Sans"/>
           <w:lang w:val="en-ID"/>
         </w:rPr>
-        <w:t>Tes</w:t>
-      </w:r>
-      <w:proofErr w:type="spellEnd"/>
-      <w:r>
-        <w:rPr>
-          <w:rFonts w:ascii="Balsamiq Sans" w:hAnsi="Balsamiq Sans"/>
-          <w:lang w:val="en-ID"/>
-        </w:rPr>
-        <w:t xml:space="preserve"> Kesehatan Dan </w:t>
-      </w:r>
-      <w:proofErr w:type="spellStart"/>
-      <w:r>
-        <w:rPr>
-          <w:rFonts w:ascii="Balsamiq Sans" w:hAnsi="Balsamiq Sans"/>
-          <w:lang w:val="en-ID"/>
-        </w:rPr>
-        <w:t>Psikologi</w:t>
+        <w:t>Formulir</w:t>
+      </w:r>
+      <w:proofErr w:type="spellEnd"/>
+      <w:r>
+        <w:rPr>
+          <w:rFonts w:ascii="Balsamiq Sans" w:hAnsi="Balsamiq Sans"/>
+          <w:lang w:val="en-ID"/>
+        </w:rPr>
+        <w:t xml:space="preserve"> </w:t>
+      </w:r>
+      <w:proofErr w:type="spellStart"/>
+      <w:r>
+        <w:rPr>
+          <w:rFonts w:ascii="Balsamiq Sans" w:hAnsi="Balsamiq Sans"/>
+          <w:lang w:val="en-ID"/>
+        </w:rPr>
+        <w:t>Pendaftaran</w:t>
+      </w:r>
+      <w:proofErr w:type="spellEnd"/>
+      <w:r>
+        <w:rPr>
+          <w:rFonts w:ascii="Balsamiq Sans" w:hAnsi="Balsamiq Sans"/>
+          <w:lang w:val="en-ID"/>
+        </w:rPr>
+        <w:t xml:space="preserve"> Yang </w:t>
+      </w:r>
+      <w:proofErr w:type="spellStart"/>
+      <w:r>
+        <w:rPr>
+          <w:rFonts w:ascii="Balsamiq Sans" w:hAnsi="Balsamiq Sans"/>
+          <w:lang w:val="en-ID"/>
+        </w:rPr>
+        <w:t>Disediakan</w:t>
       </w:r>
       <w:proofErr w:type="spellEnd"/>
       <w:r>
@@ -6176,15 +6353,15 @@
           <w:rFonts w:ascii="Balsamiq Sans" w:hAnsi="Balsamiq Sans"/>
           <w:lang w:val="en-ID"/>
         </w:rPr>
-        <w:t xml:space="preserve">6) </w:t>
-      </w:r>
-      <w:proofErr w:type="spellStart"/>
-      <w:r>
-        <w:rPr>
-          <w:rFonts w:ascii="Balsamiq Sans" w:hAnsi="Balsamiq Sans"/>
-          <w:lang w:val="en-ID"/>
-        </w:rPr>
-        <w:t>Mengikuti</w:t>
+        <w:t xml:space="preserve">4) </w:t>
+      </w:r>
+      <w:proofErr w:type="spellStart"/>
+      <w:r>
+        <w:rPr>
+          <w:rFonts w:ascii="Balsamiq Sans" w:hAnsi="Balsamiq Sans"/>
+          <w:lang w:val="en-ID"/>
+        </w:rPr>
+        <w:t>Membayar</w:t>
       </w:r>
       <w:proofErr w:type="spellEnd"/>
       <w:r>
@@ -6200,7 +6377,7 @@
           <w:rFonts w:ascii="Balsamiq Sans" w:hAnsi="Balsamiq Sans"/>
           <w:lang w:val="en-ID"/>
         </w:rPr>
-        <w:t>Ujian</w:t>
+        <w:t>Biasya</w:t>
       </w:r>
       <w:proofErr w:type="spellEnd"/>
       <w:r>
@@ -6216,15 +6393,63 @@
           <w:rFonts w:ascii="Balsamiq Sans" w:hAnsi="Balsamiq Sans"/>
           <w:lang w:val="en-ID"/>
         </w:rPr>
-        <w:t>Teori</w:t>
-      </w:r>
-      <w:proofErr w:type="spellEnd"/>
-      <w:r>
-        <w:rPr>
-          <w:rFonts w:ascii="Balsamiq Sans" w:hAnsi="Balsamiq Sans"/>
-          <w:lang w:val="en-ID"/>
-        </w:rPr>
-        <w:t xml:space="preserve">. </w:t>
+        <w:t>Pendaftaran</w:t>
+      </w:r>
+      <w:proofErr w:type="spellEnd"/>
+      <w:r>
+        <w:rPr>
+          <w:rFonts w:ascii="Balsamiq Sans" w:hAnsi="Balsamiq Sans"/>
+          <w:lang w:val="en-ID"/>
+        </w:rPr>
+        <w:t xml:space="preserve">, </w:t>
+      </w:r>
+      <w:proofErr w:type="spellStart"/>
+      <w:r>
+        <w:rPr>
+          <w:rFonts w:ascii="Balsamiq Sans" w:hAnsi="Balsamiq Sans"/>
+          <w:lang w:val="en-ID"/>
+        </w:rPr>
+        <w:t>Termasuk</w:t>
+      </w:r>
+      <w:proofErr w:type="spellEnd"/>
+      <w:r>
+        <w:rPr>
+          <w:rFonts w:ascii="Balsamiq Sans" w:hAnsi="Balsamiq Sans"/>
+          <w:lang w:val="en-ID"/>
+        </w:rPr>
+        <w:t xml:space="preserve"> </w:t>
+      </w:r>
+      <w:proofErr w:type="spellStart"/>
+      <w:r>
+        <w:rPr>
+          <w:rFonts w:ascii="Balsamiq Sans" w:hAnsi="Balsamiq Sans"/>
+          <w:lang w:val="en-ID"/>
+        </w:rPr>
+        <w:t>Asuransi</w:t>
+      </w:r>
+      <w:proofErr w:type="spellEnd"/>
+      <w:r>
+        <w:rPr>
+          <w:rFonts w:ascii="Balsamiq Sans" w:hAnsi="Balsamiq Sans"/>
+          <w:lang w:val="en-ID"/>
+        </w:rPr>
+        <w:t xml:space="preserve"> Dan </w:t>
+      </w:r>
+      <w:proofErr w:type="spellStart"/>
+      <w:r>
+        <w:rPr>
+          <w:rFonts w:ascii="Balsamiq Sans" w:hAnsi="Balsamiq Sans"/>
+          <w:lang w:val="en-ID"/>
+        </w:rPr>
+        <w:t>Tes</w:t>
+      </w:r>
+      <w:proofErr w:type="spellEnd"/>
+      <w:r>
+        <w:rPr>
+          <w:rFonts w:ascii="Balsamiq Sans" w:hAnsi="Balsamiq Sans"/>
+          <w:lang w:val="en-ID"/>
+        </w:rPr>
+        <w:t xml:space="preserve"> Kesehatan. </w:t>
       </w:r>
     </w:p>
     <w:p>
@@ -6240,31 +6465,15 @@
           <w:rFonts w:ascii="Balsamiq Sans" w:hAnsi="Balsamiq Sans"/>
           <w:lang w:val="en-ID"/>
         </w:rPr>
-        <w:t xml:space="preserve">7) Jika Lulus, </w:t>
-      </w:r>
-      <w:proofErr w:type="spellStart"/>
-      <w:r>
-        <w:rPr>
-          <w:rFonts w:ascii="Balsamiq Sans" w:hAnsi="Balsamiq Sans"/>
-          <w:lang w:val="en-ID"/>
-        </w:rPr>
-        <w:t>Lanjut</w:t>
-      </w:r>
-      <w:proofErr w:type="spellEnd"/>
-      <w:r>
-        <w:rPr>
-          <w:rFonts w:ascii="Balsamiq Sans" w:hAnsi="Balsamiq Sans"/>
-          <w:lang w:val="en-ID"/>
-        </w:rPr>
-        <w:t xml:space="preserve"> Ke </w:t>
-      </w:r>
-      <w:proofErr w:type="spellStart"/>
-      <w:r>
-        <w:rPr>
-          <w:rFonts w:ascii="Balsamiq Sans" w:hAnsi="Balsamiq Sans"/>
-          <w:lang w:val="en-ID"/>
-        </w:rPr>
-        <w:t>Tahap</w:t>
+        <w:t xml:space="preserve">5) </w:t>
+      </w:r>
+      <w:proofErr w:type="spellStart"/>
+      <w:r>
+        <w:rPr>
+          <w:rFonts w:ascii="Balsamiq Sans" w:hAnsi="Balsamiq Sans"/>
+          <w:lang w:val="en-ID"/>
+        </w:rPr>
+        <w:t>Melakukan</w:t>
       </w:r>
       <w:proofErr w:type="spellEnd"/>
       <w:r>
@@ -6280,39 +6489,23 @@
           <w:rFonts w:ascii="Balsamiq Sans" w:hAnsi="Balsamiq Sans"/>
           <w:lang w:val="en-ID"/>
         </w:rPr>
-        <w:t>Ujian</w:t>
-      </w:r>
-      <w:proofErr w:type="spellEnd"/>
-      <w:r>
-        <w:rPr>
-          <w:rFonts w:ascii="Balsamiq Sans" w:hAnsi="Balsamiq Sans"/>
-          <w:lang w:val="en-ID"/>
-        </w:rPr>
-        <w:t xml:space="preserve"> </w:t>
-      </w:r>
-      <w:proofErr w:type="spellStart"/>
-      <w:r>
-        <w:rPr>
-          <w:rFonts w:ascii="Balsamiq Sans" w:hAnsi="Balsamiq Sans"/>
-          <w:lang w:val="en-ID"/>
-        </w:rPr>
-        <w:t>Praktik</w:t>
-      </w:r>
-      <w:proofErr w:type="spellEnd"/>
-      <w:r>
-        <w:rPr>
-          <w:rFonts w:ascii="Balsamiq Sans" w:hAnsi="Balsamiq Sans"/>
-          <w:lang w:val="en-ID"/>
-        </w:rPr>
-        <w:t xml:space="preserve"> </w:t>
-      </w:r>
-      <w:proofErr w:type="spellStart"/>
-      <w:r>
-        <w:rPr>
-          <w:rFonts w:ascii="Balsamiq Sans" w:hAnsi="Balsamiq Sans"/>
-          <w:lang w:val="en-ID"/>
-        </w:rPr>
-        <w:t>Mengemudi</w:t>
+        <w:t>Tes</w:t>
+      </w:r>
+      <w:proofErr w:type="spellEnd"/>
+      <w:r>
+        <w:rPr>
+          <w:rFonts w:ascii="Balsamiq Sans" w:hAnsi="Balsamiq Sans"/>
+          <w:lang w:val="en-ID"/>
+        </w:rPr>
+        <w:t xml:space="preserve"> Kesehatan Dan </w:t>
+      </w:r>
+      <w:proofErr w:type="spellStart"/>
+      <w:r>
+        <w:rPr>
+          <w:rFonts w:ascii="Balsamiq Sans" w:hAnsi="Balsamiq Sans"/>
+          <w:lang w:val="en-ID"/>
+        </w:rPr>
+        <w:t>Psikologi</w:t>
       </w:r>
       <w:proofErr w:type="spellEnd"/>
       <w:r>
@@ -6336,15 +6529,15 @@
           <w:rFonts w:ascii="Balsamiq Sans" w:hAnsi="Balsamiq Sans"/>
           <w:lang w:val="en-ID"/>
         </w:rPr>
-        <w:t xml:space="preserve">8) Jika Lulus </w:t>
-      </w:r>
-      <w:proofErr w:type="spellStart"/>
-      <w:r>
-        <w:rPr>
-          <w:rFonts w:ascii="Balsamiq Sans" w:hAnsi="Balsamiq Sans"/>
-          <w:lang w:val="en-ID"/>
-        </w:rPr>
-        <w:t>Semua</w:t>
+        <w:t xml:space="preserve">6) </w:t>
+      </w:r>
+      <w:proofErr w:type="spellStart"/>
+      <w:r>
+        <w:rPr>
+          <w:rFonts w:ascii="Balsamiq Sans" w:hAnsi="Balsamiq Sans"/>
+          <w:lang w:val="en-ID"/>
+        </w:rPr>
+        <w:t>Mengikuti</w:t>
       </w:r>
       <w:proofErr w:type="spellEnd"/>
       <w:r>
@@ -6360,39 +6553,7 @@
           <w:rFonts w:ascii="Balsamiq Sans" w:hAnsi="Balsamiq Sans"/>
           <w:lang w:val="en-ID"/>
         </w:rPr>
-        <w:t>Tes</w:t>
-      </w:r>
-      <w:proofErr w:type="spellEnd"/>
-      <w:r>
-        <w:rPr>
-          <w:rFonts w:ascii="Balsamiq Sans" w:hAnsi="Balsamiq Sans"/>
-          <w:lang w:val="en-ID"/>
-        </w:rPr>
-        <w:t xml:space="preserve">, </w:t>
-      </w:r>
-      <w:proofErr w:type="spellStart"/>
-      <w:r>
-        <w:rPr>
-          <w:rFonts w:ascii="Balsamiq Sans" w:hAnsi="Balsamiq Sans"/>
-          <w:lang w:val="en-ID"/>
-        </w:rPr>
-        <w:t>Pemohon</w:t>
-      </w:r>
-      <w:proofErr w:type="spellEnd"/>
-      <w:r>
-        <w:rPr>
-          <w:rFonts w:ascii="Balsamiq Sans" w:hAnsi="Balsamiq Sans"/>
-          <w:lang w:val="en-ID"/>
-        </w:rPr>
-        <w:t xml:space="preserve"> Akan </w:t>
-      </w:r>
-      <w:proofErr w:type="spellStart"/>
-      <w:r>
-        <w:rPr>
-          <w:rFonts w:ascii="Balsamiq Sans" w:hAnsi="Balsamiq Sans"/>
-          <w:lang w:val="en-ID"/>
-        </w:rPr>
-        <w:t>Diminta</w:t>
+        <w:t>Ujian</w:t>
       </w:r>
       <w:proofErr w:type="spellEnd"/>
       <w:r>
@@ -6408,63 +6569,15 @@
           <w:rFonts w:ascii="Balsamiq Sans" w:hAnsi="Balsamiq Sans"/>
           <w:lang w:val="en-ID"/>
         </w:rPr>
-        <w:t>Untuk</w:t>
-      </w:r>
-      <w:proofErr w:type="spellEnd"/>
-      <w:r>
-        <w:rPr>
-          <w:rFonts w:ascii="Balsamiq Sans" w:hAnsi="Balsamiq Sans"/>
-          <w:lang w:val="en-ID"/>
-        </w:rPr>
-        <w:t xml:space="preserve"> </w:t>
-      </w:r>
-      <w:proofErr w:type="spellStart"/>
-      <w:r>
-        <w:rPr>
-          <w:rFonts w:ascii="Balsamiq Sans" w:hAnsi="Balsamiq Sans"/>
-          <w:lang w:val="en-ID"/>
-        </w:rPr>
-        <w:t>Rekam</w:t>
-      </w:r>
-      <w:proofErr w:type="spellEnd"/>
-      <w:r>
-        <w:rPr>
-          <w:rFonts w:ascii="Balsamiq Sans" w:hAnsi="Balsamiq Sans"/>
-          <w:lang w:val="en-ID"/>
-        </w:rPr>
-        <w:t xml:space="preserve"> </w:t>
-      </w:r>
-      <w:proofErr w:type="spellStart"/>
-      <w:r>
-        <w:rPr>
-          <w:rFonts w:ascii="Balsamiq Sans" w:hAnsi="Balsamiq Sans"/>
-          <w:lang w:val="en-ID"/>
-        </w:rPr>
-        <w:t>Biometrik</w:t>
-      </w:r>
-      <w:proofErr w:type="spellEnd"/>
-      <w:r>
-        <w:rPr>
-          <w:rFonts w:ascii="Balsamiq Sans" w:hAnsi="Balsamiq Sans"/>
-          <w:lang w:val="en-ID"/>
-        </w:rPr>
-        <w:t xml:space="preserve">, Tanda </w:t>
-      </w:r>
-      <w:proofErr w:type="spellStart"/>
-      <w:r>
-        <w:rPr>
-          <w:rFonts w:ascii="Balsamiq Sans" w:hAnsi="Balsamiq Sans"/>
-          <w:lang w:val="en-ID"/>
-        </w:rPr>
-        <w:t>Tangan</w:t>
-      </w:r>
-      <w:proofErr w:type="spellEnd"/>
-      <w:r>
-        <w:rPr>
-          <w:rFonts w:ascii="Balsamiq Sans" w:hAnsi="Balsamiq Sans"/>
-          <w:lang w:val="en-ID"/>
-        </w:rPr>
-        <w:t xml:space="preserve">, Dan Foto Sim C. </w:t>
+        <w:t>Teori</w:t>
+      </w:r>
+      <w:proofErr w:type="spellEnd"/>
+      <w:r>
+        <w:rPr>
+          <w:rFonts w:ascii="Balsamiq Sans" w:hAnsi="Balsamiq Sans"/>
+          <w:lang w:val="en-ID"/>
+        </w:rPr>
+        <w:t xml:space="preserve">. </w:t>
       </w:r>
     </w:p>
     <w:p>
@@ -6472,7 +6585,7 @@
         <w:ind w:left="283"/>
         <w:rPr>
           <w:rFonts w:ascii="Balsamiq Sans" w:hAnsi="Balsamiq Sans"/>
-          <w:lang w:val="en-US"/>
+          <w:lang w:val="en-ID"/>
         </w:rPr>
       </w:pPr>
       <w:r>
@@ -6480,47 +6593,31 @@
           <w:rFonts w:ascii="Balsamiq Sans" w:hAnsi="Balsamiq Sans"/>
           <w:lang w:val="en-ID"/>
         </w:rPr>
-        <w:t xml:space="preserve">9) </w:t>
-      </w:r>
-      <w:proofErr w:type="spellStart"/>
-      <w:r>
-        <w:rPr>
-          <w:rFonts w:ascii="Balsamiq Sans" w:hAnsi="Balsamiq Sans"/>
-          <w:lang w:val="en-ID"/>
-        </w:rPr>
-        <w:t>Tunggu</w:t>
-      </w:r>
-      <w:proofErr w:type="spellEnd"/>
-      <w:r>
-        <w:rPr>
-          <w:rFonts w:ascii="Balsamiq Sans" w:hAnsi="Balsamiq Sans"/>
-          <w:lang w:val="en-ID"/>
-        </w:rPr>
-        <w:t xml:space="preserve"> Proses </w:t>
-      </w:r>
-      <w:proofErr w:type="spellStart"/>
-      <w:r>
-        <w:rPr>
-          <w:rFonts w:ascii="Balsamiq Sans" w:hAnsi="Balsamiq Sans"/>
-          <w:lang w:val="en-ID"/>
-        </w:rPr>
-        <w:t>Pencetakan</w:t>
-      </w:r>
-      <w:proofErr w:type="spellEnd"/>
-      <w:r>
-        <w:rPr>
-          <w:rFonts w:ascii="Balsamiq Sans" w:hAnsi="Balsamiq Sans"/>
-          <w:lang w:val="en-ID"/>
-        </w:rPr>
-        <w:t xml:space="preserve"> Kartu, </w:t>
-      </w:r>
-      <w:proofErr w:type="spellStart"/>
-      <w:r>
-        <w:rPr>
-          <w:rFonts w:ascii="Balsamiq Sans" w:hAnsi="Balsamiq Sans"/>
-          <w:lang w:val="en-ID"/>
-        </w:rPr>
-        <w:t>Kemudian</w:t>
+        <w:t xml:space="preserve">7) Jika Lulus, </w:t>
+      </w:r>
+      <w:proofErr w:type="spellStart"/>
+      <w:r>
+        <w:rPr>
+          <w:rFonts w:ascii="Balsamiq Sans" w:hAnsi="Balsamiq Sans"/>
+          <w:lang w:val="en-ID"/>
+        </w:rPr>
+        <w:t>Lanjut</w:t>
+      </w:r>
+      <w:proofErr w:type="spellEnd"/>
+      <w:r>
+        <w:rPr>
+          <w:rFonts w:ascii="Balsamiq Sans" w:hAnsi="Balsamiq Sans"/>
+          <w:lang w:val="en-ID"/>
+        </w:rPr>
+        <w:t xml:space="preserve"> Ke </w:t>
+      </w:r>
+      <w:proofErr w:type="spellStart"/>
+      <w:r>
+        <w:rPr>
+          <w:rFonts w:ascii="Balsamiq Sans" w:hAnsi="Balsamiq Sans"/>
+          <w:lang w:val="en-ID"/>
+        </w:rPr>
+        <w:t>Tahap</w:t>
       </w:r>
       <w:proofErr w:type="spellEnd"/>
       <w:r>
@@ -6536,92 +6633,288 @@
           <w:rFonts w:ascii="Balsamiq Sans" w:hAnsi="Balsamiq Sans"/>
           <w:lang w:val="en-ID"/>
         </w:rPr>
-        <w:t>Pemohon</w:t>
-      </w:r>
-      <w:proofErr w:type="spellEnd"/>
-      <w:r>
-        <w:rPr>
-          <w:rFonts w:ascii="Balsamiq Sans" w:hAnsi="Balsamiq Sans"/>
-          <w:lang w:val="en-ID"/>
-        </w:rPr>
-        <w:t xml:space="preserve"> Akan </w:t>
-      </w:r>
-      <w:proofErr w:type="spellStart"/>
-      <w:r>
-        <w:rPr>
-          <w:rFonts w:ascii="Balsamiq Sans" w:hAnsi="Balsamiq Sans"/>
-          <w:lang w:val="en-ID"/>
-        </w:rPr>
-        <w:t>Dipanggil</w:t>
-      </w:r>
-      <w:proofErr w:type="spellEnd"/>
-      <w:r>
-        <w:rPr>
-          <w:rFonts w:ascii="Balsamiq Sans" w:hAnsi="Balsamiq Sans"/>
-          <w:lang w:val="en-ID"/>
-        </w:rPr>
-        <w:t>.</w:t>
+        <w:t>Ujian</w:t>
+      </w:r>
+      <w:proofErr w:type="spellEnd"/>
+      <w:r>
+        <w:rPr>
+          <w:rFonts w:ascii="Balsamiq Sans" w:hAnsi="Balsamiq Sans"/>
+          <w:lang w:val="en-ID"/>
+        </w:rPr>
+        <w:t xml:space="preserve"> </w:t>
+      </w:r>
+      <w:proofErr w:type="spellStart"/>
+      <w:r>
+        <w:rPr>
+          <w:rFonts w:ascii="Balsamiq Sans" w:hAnsi="Balsamiq Sans"/>
+          <w:lang w:val="en-ID"/>
+        </w:rPr>
+        <w:t>Praktik</w:t>
+      </w:r>
+      <w:proofErr w:type="spellEnd"/>
+      <w:r>
+        <w:rPr>
+          <w:rFonts w:ascii="Balsamiq Sans" w:hAnsi="Balsamiq Sans"/>
+          <w:lang w:val="en-ID"/>
+        </w:rPr>
+        <w:t xml:space="preserve"> </w:t>
+      </w:r>
+      <w:proofErr w:type="spellStart"/>
+      <w:r>
+        <w:rPr>
+          <w:rFonts w:ascii="Balsamiq Sans" w:hAnsi="Balsamiq Sans"/>
+          <w:lang w:val="en-ID"/>
+        </w:rPr>
+        <w:t>Mengemudi</w:t>
+      </w:r>
+      <w:proofErr w:type="spellEnd"/>
+      <w:r>
+        <w:rPr>
+          <w:rFonts w:ascii="Balsamiq Sans" w:hAnsi="Balsamiq Sans"/>
+          <w:lang w:val="en-ID"/>
+        </w:rPr>
+        <w:t xml:space="preserve">. </w:t>
       </w:r>
     </w:p>
     <w:p>
       <w:pPr>
-        <w:rPr>
-          <w:rFonts w:ascii="Balsamiq Sans" w:hAnsi="Balsamiq Sans"/>
-          <w:b/>
-          <w:bCs/>
-          <w:lang w:val="en-US"/>
+        <w:ind w:left="283"/>
+        <w:rPr>
+          <w:rFonts w:ascii="Balsamiq Sans" w:hAnsi="Balsamiq Sans"/>
+          <w:lang w:val="en-ID"/>
         </w:rPr>
       </w:pPr>
+      <w:r>
+        <w:rPr>
+          <w:rFonts w:ascii="Balsamiq Sans" w:hAnsi="Balsamiq Sans"/>
+          <w:lang w:val="en-ID"/>
+        </w:rPr>
+        <w:t xml:space="preserve">8) Jika Lulus </w:t>
+      </w:r>
+      <w:proofErr w:type="spellStart"/>
+      <w:r>
+        <w:rPr>
+          <w:rFonts w:ascii="Balsamiq Sans" w:hAnsi="Balsamiq Sans"/>
+          <w:lang w:val="en-ID"/>
+        </w:rPr>
+        <w:t>Semua</w:t>
+      </w:r>
+      <w:proofErr w:type="spellEnd"/>
+      <w:r>
+        <w:rPr>
+          <w:rFonts w:ascii="Balsamiq Sans" w:hAnsi="Balsamiq Sans"/>
+          <w:lang w:val="en-ID"/>
+        </w:rPr>
+        <w:t xml:space="preserve"> </w:t>
+      </w:r>
+      <w:proofErr w:type="spellStart"/>
+      <w:r>
+        <w:rPr>
+          <w:rFonts w:ascii="Balsamiq Sans" w:hAnsi="Balsamiq Sans"/>
+          <w:lang w:val="en-ID"/>
+        </w:rPr>
+        <w:t>Tes</w:t>
+      </w:r>
+      <w:proofErr w:type="spellEnd"/>
+      <w:r>
+        <w:rPr>
+          <w:rFonts w:ascii="Balsamiq Sans" w:hAnsi="Balsamiq Sans"/>
+          <w:lang w:val="en-ID"/>
+        </w:rPr>
+        <w:t xml:space="preserve">, </w:t>
+      </w:r>
+      <w:proofErr w:type="spellStart"/>
+      <w:r>
+        <w:rPr>
+          <w:rFonts w:ascii="Balsamiq Sans" w:hAnsi="Balsamiq Sans"/>
+          <w:lang w:val="en-ID"/>
+        </w:rPr>
+        <w:t>Pemohon</w:t>
+      </w:r>
+      <w:proofErr w:type="spellEnd"/>
+      <w:r>
+        <w:rPr>
+          <w:rFonts w:ascii="Balsamiq Sans" w:hAnsi="Balsamiq Sans"/>
+          <w:lang w:val="en-ID"/>
+        </w:rPr>
+        <w:t xml:space="preserve"> Akan </w:t>
+      </w:r>
+      <w:proofErr w:type="spellStart"/>
+      <w:r>
+        <w:rPr>
+          <w:rFonts w:ascii="Balsamiq Sans" w:hAnsi="Balsamiq Sans"/>
+          <w:lang w:val="en-ID"/>
+        </w:rPr>
+        <w:t>Diminta</w:t>
+      </w:r>
+      <w:proofErr w:type="spellEnd"/>
+      <w:r>
+        <w:rPr>
+          <w:rFonts w:ascii="Balsamiq Sans" w:hAnsi="Balsamiq Sans"/>
+          <w:lang w:val="en-ID"/>
+        </w:rPr>
+        <w:t xml:space="preserve"> </w:t>
+      </w:r>
+      <w:proofErr w:type="spellStart"/>
+      <w:r>
+        <w:rPr>
+          <w:rFonts w:ascii="Balsamiq Sans" w:hAnsi="Balsamiq Sans"/>
+          <w:lang w:val="en-ID"/>
+        </w:rPr>
+        <w:t>Untuk</w:t>
+      </w:r>
+      <w:proofErr w:type="spellEnd"/>
+      <w:r>
+        <w:rPr>
+          <w:rFonts w:ascii="Balsamiq Sans" w:hAnsi="Balsamiq Sans"/>
+          <w:lang w:val="en-ID"/>
+        </w:rPr>
+        <w:t xml:space="preserve"> </w:t>
+      </w:r>
+      <w:proofErr w:type="spellStart"/>
+      <w:r>
+        <w:rPr>
+          <w:rFonts w:ascii="Balsamiq Sans" w:hAnsi="Balsamiq Sans"/>
+          <w:lang w:val="en-ID"/>
+        </w:rPr>
+        <w:t>Rekam</w:t>
+      </w:r>
+      <w:proofErr w:type="spellEnd"/>
+      <w:r>
+        <w:rPr>
+          <w:rFonts w:ascii="Balsamiq Sans" w:hAnsi="Balsamiq Sans"/>
+          <w:lang w:val="en-ID"/>
+        </w:rPr>
+        <w:t xml:space="preserve"> </w:t>
+      </w:r>
+      <w:proofErr w:type="spellStart"/>
+      <w:r>
+        <w:rPr>
+          <w:rFonts w:ascii="Balsamiq Sans" w:hAnsi="Balsamiq Sans"/>
+          <w:lang w:val="en-ID"/>
+        </w:rPr>
+        <w:t>Biometrik</w:t>
+      </w:r>
+      <w:proofErr w:type="spellEnd"/>
+      <w:r>
+        <w:rPr>
+          <w:rFonts w:ascii="Balsamiq Sans" w:hAnsi="Balsamiq Sans"/>
+          <w:lang w:val="en-ID"/>
+        </w:rPr>
+        <w:t xml:space="preserve">, Tanda </w:t>
+      </w:r>
+      <w:proofErr w:type="spellStart"/>
+      <w:r>
+        <w:rPr>
+          <w:rFonts w:ascii="Balsamiq Sans" w:hAnsi="Balsamiq Sans"/>
+          <w:lang w:val="en-ID"/>
+        </w:rPr>
+        <w:t>Tangan</w:t>
+      </w:r>
+      <w:proofErr w:type="spellEnd"/>
+      <w:r>
+        <w:rPr>
+          <w:rFonts w:ascii="Balsamiq Sans" w:hAnsi="Balsamiq Sans"/>
+          <w:lang w:val="en-ID"/>
+        </w:rPr>
+        <w:t xml:space="preserve">, Dan Foto Sim C. </w:t>
+      </w:r>
     </w:p>
     <w:p>
       <w:pPr>
-        <w:rPr>
-          <w:rFonts w:ascii="Balsamiq Sans" w:hAnsi="Balsamiq Sans"/>
-          <w:b/>
-          <w:bCs/>
+        <w:ind w:left="283"/>
+        <w:rPr>
+          <w:rFonts w:ascii="Balsamiq Sans" w:hAnsi="Balsamiq Sans"/>
           <w:lang w:val="en-US"/>
         </w:rPr>
       </w:pPr>
-    </w:p>
-    <w:p>
-      <w:pPr>
-        <w:rPr>
-          <w:rFonts w:ascii="Balsamiq Sans" w:hAnsi="Balsamiq Sans"/>
-          <w:b/>
-          <w:bCs/>
-          <w:lang w:val="en-US"/>
-        </w:rPr>
-      </w:pPr>
-    </w:p>
-    <w:p>
-      <w:pPr>
-        <w:rPr>
-          <w:rFonts w:ascii="Balsamiq Sans" w:hAnsi="Balsamiq Sans"/>
-          <w:b/>
-          <w:bCs/>
-          <w:lang w:val="en-US"/>
-        </w:rPr>
-      </w:pPr>
-    </w:p>
-    <w:p>
-      <w:pPr>
-        <w:rPr>
-          <w:rFonts w:ascii="Balsamiq Sans" w:hAnsi="Balsamiq Sans"/>
-          <w:b/>
-          <w:bCs/>
-          <w:lang w:val="en-US"/>
-        </w:rPr>
-      </w:pPr>
-    </w:p>
-    <w:p>
-      <w:pPr>
-        <w:rPr>
-          <w:rFonts w:ascii="Balsamiq Sans" w:hAnsi="Balsamiq Sans"/>
-          <w:b/>
-          <w:bCs/>
-          <w:lang w:val="en-US"/>
-        </w:rPr>
-      </w:pPr>
+      <w:r>
+        <w:rPr>
+          <w:rFonts w:ascii="Balsamiq Sans" w:hAnsi="Balsamiq Sans"/>
+          <w:lang w:val="en-ID"/>
+        </w:rPr>
+        <w:t xml:space="preserve">9) </w:t>
+      </w:r>
+      <w:proofErr w:type="spellStart"/>
+      <w:r>
+        <w:rPr>
+          <w:rFonts w:ascii="Balsamiq Sans" w:hAnsi="Balsamiq Sans"/>
+          <w:lang w:val="en-ID"/>
+        </w:rPr>
+        <w:t>Tunggu</w:t>
+      </w:r>
+      <w:proofErr w:type="spellEnd"/>
+      <w:r>
+        <w:rPr>
+          <w:rFonts w:ascii="Balsamiq Sans" w:hAnsi="Balsamiq Sans"/>
+          <w:lang w:val="en-ID"/>
+        </w:rPr>
+        <w:t xml:space="preserve"> Proses </w:t>
+      </w:r>
+      <w:proofErr w:type="spellStart"/>
+      <w:r>
+        <w:rPr>
+          <w:rFonts w:ascii="Balsamiq Sans" w:hAnsi="Balsamiq Sans"/>
+          <w:lang w:val="en-ID"/>
+        </w:rPr>
+        <w:t>Pencetakan</w:t>
+      </w:r>
+      <w:proofErr w:type="spellEnd"/>
+      <w:r>
+        <w:rPr>
+          <w:rFonts w:ascii="Balsamiq Sans" w:hAnsi="Balsamiq Sans"/>
+          <w:lang w:val="en-ID"/>
+        </w:rPr>
+        <w:t xml:space="preserve"> Kartu, </w:t>
+      </w:r>
+      <w:proofErr w:type="spellStart"/>
+      <w:r>
+        <w:rPr>
+          <w:rFonts w:ascii="Balsamiq Sans" w:hAnsi="Balsamiq Sans"/>
+          <w:lang w:val="en-ID"/>
+        </w:rPr>
+        <w:t>Kemudian</w:t>
+      </w:r>
+      <w:proofErr w:type="spellEnd"/>
+      <w:r>
+        <w:rPr>
+          <w:rFonts w:ascii="Balsamiq Sans" w:hAnsi="Balsamiq Sans"/>
+          <w:lang w:val="en-ID"/>
+        </w:rPr>
+        <w:t xml:space="preserve"> </w:t>
+      </w:r>
+      <w:proofErr w:type="spellStart"/>
+      <w:r>
+        <w:rPr>
+          <w:rFonts w:ascii="Balsamiq Sans" w:hAnsi="Balsamiq Sans"/>
+          <w:lang w:val="en-ID"/>
+        </w:rPr>
+        <w:t>Pemohon</w:t>
+      </w:r>
+      <w:proofErr w:type="spellEnd"/>
+      <w:r>
+        <w:rPr>
+          <w:rFonts w:ascii="Balsamiq Sans" w:hAnsi="Balsamiq Sans"/>
+          <w:lang w:val="en-ID"/>
+        </w:rPr>
+        <w:t xml:space="preserve"> Akan </w:t>
+      </w:r>
+      <w:proofErr w:type="spellStart"/>
+      <w:r>
+        <w:rPr>
+          <w:rFonts w:ascii="Balsamiq Sans" w:hAnsi="Balsamiq Sans"/>
+          <w:lang w:val="en-ID"/>
+        </w:rPr>
+        <w:t>Dipanggil</w:t>
+      </w:r>
+      <w:proofErr w:type="spellEnd"/>
+      <w:r>
+        <w:rPr>
+          <w:rFonts w:ascii="Balsamiq Sans" w:hAnsi="Balsamiq Sans"/>
+          <w:lang w:val="en-ID"/>
+        </w:rPr>
+        <w:t>.</w:t>
+      </w:r>
     </w:p>
     <w:p>
       <w:pPr>
@@ -16801,7 +17094,9 @@
     <w:rsid w:val="006966E0"/>
     <w:rsid w:val="00713F88"/>
     <w:rsid w:val="007B12C0"/>
+    <w:rsid w:val="00864FB6"/>
     <w:rsid w:val="00935CEA"/>
+    <w:rsid w:val="009E37C4"/>
     <w:rsid w:val="00B40BAE"/>
     <w:rsid w:val="00CF23CB"/>
     <w:rsid w:val="00DF2FE0"/>

</xml_diff>